<commit_message>
Ve lai bo cong thuc Lewis cua NH3 do net cao (Vector PDF, PNG 300DPI, 600DPI, transparent) va cap nhat de thi Ma 104
</commit_message>
<xml_diff>
--- a/San_Pham/De_Kiem_Tra_Hoa_11_Ma104.docx
+++ b/San_Pham/De_Kiem_Tra_Hoa_11_Ma104.docx
@@ -2316,7 +2316,7 @@
       <w:r>
         <w:drawing>
           <wp:inline xmlns:a="http://schemas.openxmlformats.org/drawingml/2006/main" xmlns:pic="http://schemas.openxmlformats.org/drawingml/2006/picture">
-            <wp:extent cx="4320000" cy="512000"/>
+            <wp:extent cx="4320000" cy="958246"/>
             <wp:docPr id="1" name="Picture 1"/>
             <wp:cNvGraphicFramePr>
               <a:graphicFrameLocks noChangeAspect="1"/>
@@ -2337,7 +2337,7 @@
                   <pic:spPr>
                     <a:xfrm>
                       <a:off x="0" y="0"/>
-                      <a:ext cx="4320000" cy="512000"/>
+                      <a:ext cx="4320000" cy="958246"/>
                     </a:xfrm>
                     <a:prstGeom prst="rect"/>
                   </pic:spPr>

</xml_diff>